<commit_message>
Fuse priority resources and implement durable workstation control-plane PoC
</commit_message>
<xml_diff>
--- a/deliverables/v2.0/架构设计与方案说明.docx
+++ b/deliverables/v2.0/架构设计与方案说明.docx
@@ -7,7 +7,7 @@
         <w:pStyle w:val="Title"/>
       </w:pPr>
       <w:r>
-        <w:t>THESIS ATELIER：毕设论文工作站设计方案 v2.0</w:t>
+        <w:t>THESIS ATELIER：毕设论文工作站设计方案 v2.1</w:t>
       </w:r>
     </w:p>
     <w:p>
@@ -18,6 +18,11 @@
     <w:p>
       <w:r>
         <w:t>本次建议把工作站设计成一个“研究与工程工作室”：长期岗位组成按项目变化的小队，任务图掌握执行，工程决策保存为什么，证据链把真实成果带进论文。先完成计算机开题与外文材料，再按计算机工程 → 二维 CAD → 三维 CAD → CAE → PLC 的顺序扩展；电气、电子、嵌入式、通信和跨专业路线保留完整配置。</w:t>
+      </w:r>
+    </w:p>
+    <w:p>
+      <w:r>
+        <w:t>本版根据你对资源利用不足的反馈，重点融合文件名以111开头的23条记录（22主题）。新增7套资源组合、组合编译原型、双审计门禁、证据变更联动和融合架构；逐项去向见《111重点资源融合方案》。</w:t>
       </w:r>
     </w:p>
     <w:p>
@@ -936,6 +941,19 @@
     <w:p>
       <w:r>
         <w:t>“缺口雷达”集中列出事实、全文、模板、能力与证据不足；可设计项交建议，真实信息等待你提供。它不会通过生成假文献或假测试数据填补缺口。</w:t>
+      </w:r>
+    </w:p>
+    <w:p>
+      <w:pPr>
+        <w:pStyle w:val="Heading2"/>
+      </w:pPr>
+      <w:r>
+        <w:t>4.7 111资源融合：让功能之间产生协同</w:t>
+      </w:r>
+    </w:p>
+    <w:p>
+      <w:r>
+        <w:t>Goalcraft将目标转为验收契约，双Shadow分别审工程质量和目标达成，Notes保留有效决定。PI、Rovai、Co-Space与远程能力候选共同服务一个项目驾驶舱；科研/Zotero、检索和解析将真来源交给章节；工程数据通过版本证据投影为图、论文和答辩。参数变化沿依赖边标记相关内容过期，旧generation审计报告不能放行新成果。融合实验室可选择专业和选装能力，编译7套演示蓝图并查看缺口与关卡。详细组合、真实协议证据和新增成本见《111重点资源融合方案》。</w:t>
       </w:r>
     </w:p>
     <w:p>
@@ -4088,7 +4106,7 @@
     </w:p>
     <w:p>
       <w:r>
-        <w:t>11个页面：项目总览、项目工作区、方案确认、Agent团队、任务编排、工程决策板、证据与章节、成果与验收、开源资源库、故障与恢复、系统架构。</w:t>
+        <w:t>12个页面（新增111资源融合实验室）：项目总览、项目工作区、方案确认、Agent团队、任务编排、工程决策板、证据与章节、成果与验收、开源资源库、故障与恢复、系统架构。</w:t>
       </w:r>
     </w:p>
     <w:p>
@@ -4347,7 +4365,7 @@
     <w:p/>
     <w:p>
       <w:r>
-        <w:t>首版约28–43人日，通常6–9周量级，取决于模板、工具接口和反馈；开发Agent并不按数量线性压缩工期。CAD、CAE、TIA及跨专业阶段单独估算，不计入首版。</w:t>
+        <w:t>基础闭环约28–43人日；v2.1完整资源组合编译、版本审计与证据变更联动暂加5–9人日，去重后的设计估算约33–52人日，取决于模板、工具接口和反馈；开发Agent并不按数量线性压缩工期。CAD、CAE、TIA及跨专业阶段单独估算，不计入首版。</w:t>
       </w:r>
     </w:p>
     <w:p>
@@ -4893,6 +4911,34 @@
         <w:t>你评估时主要判断：页面是否符合工作习惯、团队协作是否清楚、失败处理是否安心、首版边界是否合适、开源组合是否值得进入PoC。所有已确认的要求会继续沿用，待确认只影响新提出的实现取舍。</w:t>
       </w:r>
     </w:p>
+    <w:p>
+      <w:pPr>
+        <w:pStyle w:val="Heading1"/>
+      </w:pPr>
+      <w:r>
+        <w:t>14. v2.1资源融合的开发接缝</w:t>
+      </w:r>
+    </w:p>
+    <w:p>
+      <w:r>
+        <w:t>新增配置 `fusion-blueprints.json`、`fusion-gate-policy.json` 和 `evidence-impact.schema.json`。蓝图编译器输入真实需求、专业队伍与已自测能力，生成引用完整且无循环的任务DAG；未知能力列为待接入，不能通过生产编译。外部协作/开发工具都经过适配器映射到唯一领域状态。</w:t>
+      </w:r>
+    </w:p>
+    <w:p>
+      <w:r>
+        <w:t>Goalcraft的G1–G4成为输入与能力门禁；pi-shadow-mind的只读审计和generation聚合成为独立报告的版本门禁；HTML输出技能的局部更新、变化对照和src/lines溯源成为证据展示规则；PavedPath的版本/issue/mergedPR证据和本地验证成为资源研究交付合同。四项协议已读取固定版本核心文件，证据在 `research/111-repo-evidence.json`，并未声称其执行器已经部署。</w:t>
+      </w:r>
+    </w:p>
+    <w:p>
+      <w:r>
+        <w:t>每个证据包含来源对象、输入/输出哈希、运行身份、方案和generation；修改沿depends_on边传播，生成新版本与待复核清单。没有对象级来源时采用保守的文件级失效，不能凭模型猜测局部有效。双审计均明确通过后仍待用户验收，沉默属于pending；旧报告保留为历史。</w:t>
+      </w:r>
+    </w:p>
+    <w:p>
+      <w:r>
+        <w:t>前端新增111资源融合入口、23条重点筛选和融合架构切换。新交互模拟及真实浏览器验证分别在融合原型与测试报告中记录；原始方案、岗位和专业节点继续保留。</w:t>
+      </w:r>
+    </w:p>
     <w:sectPr>
       <w:footerReference w:type="default" r:id="rId9"/>
       <w:pgSz w:w="12240" w:h="15840"/>
@@ -4915,7 +4961,7 @@
       <w:rPr>
         <w:sz w:val="16"/>
       </w:rPr>
-      <w:t xml:space="preserve">THESIS ATELIER · 设计评审 v2.0　</w:t>
+      <w:t xml:space="preserve">THESIS ATELIER · 设计评审 v2.1　</w:t>
     </w:r>
     <w:fldSimple w:instr="PAGE"/>
   </w:p>

</xml_diff>